<commit_message>
adición de segunda versión de ponencia para congreso
</commit_message>
<xml_diff>
--- a/propuesta/prop_invest/congreso_internacional_entornos_aprendizaje_innovadores/propuesta_didactica_ML.docx
+++ b/propuesta/prop_invest/congreso_internacional_entornos_aprendizaje_innovadores/propuesta_didactica_ML.docx
@@ -464,6 +464,7 @@
             <w:listItem w:displayText="Buenas Prácticas en la Enseñanza" w:value="Buenas Prácticas en la Enseñanza"/>
           </w:dropDownList>
         </w:sdtPr>
+        <w:sdtEndPr/>
         <w:sdtContent>
           <w:r>
             <w:rPr>
@@ -526,6 +527,7 @@
         <w:t xml:space="preserve"> </w:t>
       </w:r>
     </w:p>
+    <w:bookmarkStart w:id="0" w:name="_Hlk134279092" w:displacedByCustomXml="next"/>
     <w:sdt>
       <w:sdtPr>
         <w:rPr>
@@ -560,64 +562,6 @@
           </w:pPr>
           <w:r>
             <w:rPr>
-              <w:rFonts w:ascii="Spranq eco sans" w:hAnsi="Spranq eco sans"/>
-              <w:color w:val="7F7F7F" w:themeColor="text1" w:themeTint="80"/>
-              <w:sz w:val="20"/>
-            </w:rPr>
-            <w:t>Resumen</w:t>
-          </w:r>
-          <w:r>
-            <w:rPr>
-              <w:rFonts w:ascii="Spranq eco sans" w:eastAsia="Times New Roman" w:hAnsi="Spranq eco sans" w:cs="Times New Roman"/>
-              <w:color w:val="7F7F7F" w:themeColor="text1" w:themeTint="80"/>
-              <w:sz w:val="20"/>
-              <w:szCs w:val="20"/>
-              <w:lang w:val="es-ES"/>
-            </w:rPr>
-            <w:t xml:space="preserve"> en español </w:t>
-          </w:r>
-          <w:r>
-            <w:rPr>
-              <w:rFonts w:ascii="Spranq eco sans" w:eastAsia="Times New Roman" w:hAnsi="Spranq eco sans" w:cs="Times New Roman"/>
-              <w:color w:val="7F7F7F" w:themeColor="text1" w:themeTint="80"/>
-              <w:sz w:val="20"/>
-              <w:szCs w:val="20"/>
-              <w:lang w:val="es-ES"/>
-            </w:rPr>
-            <w:t>debe estar entre 250 y 300</w:t>
-          </w:r>
-          <w:r>
-            <w:rPr>
-              <w:rFonts w:ascii="Spranq eco sans" w:eastAsia="Times New Roman" w:hAnsi="Spranq eco sans" w:cs="Times New Roman"/>
-              <w:color w:val="7F7F7F" w:themeColor="text1" w:themeTint="80"/>
-              <w:sz w:val="20"/>
-              <w:szCs w:val="24"/>
-              <w:lang w:val="es-ES"/>
-            </w:rPr>
-            <w:t xml:space="preserve"> caracteres</w:t>
-          </w:r>
-          <w:r>
-            <w:rPr>
-              <w:rFonts w:ascii="Spranq eco sans" w:eastAsia="Times New Roman" w:hAnsi="Spranq eco sans" w:cs="Times New Roman"/>
-              <w:color w:val="7F7F7F" w:themeColor="text1" w:themeTint="80"/>
-              <w:sz w:val="20"/>
-              <w:szCs w:val="20"/>
-              <w:lang w:val="es-ES"/>
-            </w:rPr>
-            <w:t xml:space="preserve">. </w:t>
-          </w:r>
-          <w:r>
-            <w:rPr>
-              <w:rFonts w:ascii="Spranq eco sans" w:eastAsia="Times New Roman" w:hAnsi="Spranq eco sans" w:cs="Times New Roman"/>
-              <w:color w:val="7F7F7F" w:themeColor="text1" w:themeTint="80"/>
-              <w:sz w:val="20"/>
-              <w:szCs w:val="24"/>
-              <w:lang w:val="es-ES"/>
-            </w:rPr>
-            <w:t>A través del resumen deben evidenciarse: objetivos, metodología utilizada en la investigación o innovación, desarrollo y conclusiones.</w:t>
-          </w:r>
-          <w:r>
-            <w:rPr>
               <w:rFonts w:ascii="Spranq eco sans" w:eastAsia="Times New Roman" w:hAnsi="Spranq eco sans" w:cs="Times New Roman"/>
               <w:color w:val="7F7F7F" w:themeColor="text1" w:themeTint="80"/>
               <w:sz w:val="20"/>
@@ -780,6 +724,7 @@
         </w:p>
       </w:sdtContent>
     </w:sdt>
+    <w:bookmarkEnd w:id="0"/>
     <w:p>
       <w:pPr>
         <w:spacing w:after="0"/>
@@ -983,6 +928,7 @@
           <w:docPart w:val="8409CBF5F22743D4A47FF01C2B507B8B"/>
         </w:placeholder>
       </w:sdtPr>
+      <w:sdtEndPr/>
       <w:sdtContent>
         <w:p>
           <w:pPr>
@@ -1078,8 +1024,17 @@
               <w:sz w:val="20"/>
               <w:lang w:val="en-US"/>
             </w:rPr>
+            <w:t xml:space="preserve">This proposal includes didactic experience for teaching data science through two courses: Machine Learning and Introduction to Machine Learning applied to ninth and tenth semester students of the Faculty of Exact and Natural Sciences of the University of Antioquia. It is presented as an innovative strategy in higher </w:t>
+          </w:r>
+          <w:r>
+            <w:rPr>
+              <w:rFonts w:ascii="Spranq eco sans" w:hAnsi="Spranq eco sans"/>
+              <w:color w:val="7F7F7F" w:themeColor="text1" w:themeTint="80"/>
+              <w:sz w:val="20"/>
+              <w:lang w:val="en-US"/>
+            </w:rPr>
             <w:lastRenderedPageBreak/>
-            <w:t xml:space="preserve">This proposal includes didactic experience for teaching data science through two courses: Machine Learning and Introduction to Machine Learning applied to ninth and tenth semester students of the Faculty of Exact and Natural Sciences of the University of Antioquia. It is presented as an innovative strategy in higher education, because given the new reality of virtual education, which enhances the use of digital resources, a process was established that facilitated interaction in learning and the development of skills, based on the constitution of an articulated system of teaching resources, appropriation of knowledge and evaluation, which involves the platforms GitHub from Microsoft, </w:t>
+            <w:t xml:space="preserve">education, because given the new reality of virtual education, which enhances the use of digital resources, a process was established that facilitated interaction in learning and the development of skills, based on the constitution of an articulated system of teaching resources, appropriation of knowledge and evaluation, which involves the platforms GitHub from Microsoft, </w:t>
           </w:r>
           <w:proofErr w:type="spellStart"/>
           <w:r>
@@ -1234,15 +1189,65 @@
               <w:rFonts w:ascii="Spranq eco sans" w:hAnsi="Spranq eco sans"/>
               <w:color w:val="7F7F7F" w:themeColor="text1" w:themeTint="80"/>
               <w:sz w:val="20"/>
-            </w:rPr>
-          </w:pPr>
-          <w:r>
-            <w:rPr>
-              <w:rFonts w:ascii="Spranq eco sans" w:hAnsi="Spranq eco sans"/>
-              <w:color w:val="7F7F7F" w:themeColor="text1" w:themeTint="80"/>
-              <w:sz w:val="20"/>
-            </w:rPr>
-            <w:t>Identifican el tema central de la ponencia. Las palabras en inglés, deben ser organizadas en orden alfabético. Entre tres y cinco palabras.</w:t>
+              <w:lang w:val="en-US"/>
+            </w:rPr>
+          </w:pPr>
+          <w:r>
+            <w:rPr>
+              <w:rFonts w:ascii="Spranq eco sans" w:hAnsi="Spranq eco sans"/>
+              <w:color w:val="7F7F7F" w:themeColor="text1" w:themeTint="80"/>
+              <w:sz w:val="20"/>
+            </w:rPr>
+            <w:t xml:space="preserve">Identifican el tema central de la ponencia. Las palabras en inglés, deben ser organizadas en orden alfabético. </w:t>
+          </w:r>
+          <w:r>
+            <w:rPr>
+              <w:rFonts w:ascii="Spranq eco sans" w:hAnsi="Spranq eco sans"/>
+              <w:color w:val="7F7F7F" w:themeColor="text1" w:themeTint="80"/>
+              <w:sz w:val="20"/>
+              <w:lang w:val="en-US"/>
+            </w:rPr>
+            <w:t xml:space="preserve">Entre </w:t>
+          </w:r>
+          <w:proofErr w:type="spellStart"/>
+          <w:r>
+            <w:rPr>
+              <w:rFonts w:ascii="Spranq eco sans" w:hAnsi="Spranq eco sans"/>
+              <w:color w:val="7F7F7F" w:themeColor="text1" w:themeTint="80"/>
+              <w:sz w:val="20"/>
+              <w:lang w:val="en-US"/>
+            </w:rPr>
+            <w:t>tres</w:t>
+          </w:r>
+          <w:proofErr w:type="spellEnd"/>
+          <w:r>
+            <w:rPr>
+              <w:rFonts w:ascii="Spranq eco sans" w:hAnsi="Spranq eco sans"/>
+              <w:color w:val="7F7F7F" w:themeColor="text1" w:themeTint="80"/>
+              <w:sz w:val="20"/>
+              <w:lang w:val="en-US"/>
+            </w:rPr>
+            <w:t xml:space="preserve"> y </w:t>
+          </w:r>
+          <w:proofErr w:type="spellStart"/>
+          <w:r>
+            <w:rPr>
+              <w:rFonts w:ascii="Spranq eco sans" w:hAnsi="Spranq eco sans"/>
+              <w:color w:val="7F7F7F" w:themeColor="text1" w:themeTint="80"/>
+              <w:sz w:val="20"/>
+              <w:lang w:val="en-US"/>
+            </w:rPr>
+            <w:t>cinco</w:t>
+          </w:r>
+          <w:proofErr w:type="spellEnd"/>
+          <w:r>
+            <w:rPr>
+              <w:rFonts w:ascii="Spranq eco sans" w:hAnsi="Spranq eco sans"/>
+              <w:color w:val="7F7F7F" w:themeColor="text1" w:themeTint="80"/>
+              <w:sz w:val="20"/>
+              <w:lang w:val="en-US"/>
+            </w:rPr>
+            <w:t xml:space="preserve"> palabras.</w:t>
           </w:r>
         </w:p>
         <w:p>
@@ -1253,6 +1258,7 @@
               <w:rFonts w:ascii="Spranq eco sans" w:hAnsi="Spranq eco sans"/>
               <w:color w:val="7F7F7F" w:themeColor="text1" w:themeTint="80"/>
               <w:sz w:val="20"/>
+              <w:lang w:val="en-US"/>
             </w:rPr>
           </w:pPr>
         </w:p>
@@ -2089,25 +2095,25 @@
             <w:rPr>
               <w:rFonts w:ascii="Arial" w:hAnsi="Arial" w:cs="Arial"/>
             </w:rPr>
+            <w:t>tradicional de aprendizaje, aporta mayor énfasis a la práctica, pero que aún no</w:t>
+          </w:r>
+          <w:r>
+            <w:br/>
+          </w:r>
+          <w:r>
+            <w:rPr>
+              <w:rFonts w:ascii="Arial" w:hAnsi="Arial" w:cs="Arial"/>
+            </w:rPr>
+            <w:t>tiene una definición uniforme. Se expone a continuación el concepto de Quiroga A,</w:t>
+          </w:r>
+          <w:r>
+            <w:br/>
+          </w:r>
+          <w:r>
+            <w:rPr>
+              <w:rFonts w:ascii="Arial" w:hAnsi="Arial" w:cs="Arial"/>
+            </w:rPr>
             <w:lastRenderedPageBreak/>
-            <w:t>tradicional de aprendizaje, aporta mayor énfasis a la práctica, pero que aún no</w:t>
-          </w:r>
-          <w:r>
-            <w:br/>
-          </w:r>
-          <w:r>
-            <w:rPr>
-              <w:rFonts w:ascii="Arial" w:hAnsi="Arial" w:cs="Arial"/>
-            </w:rPr>
-            <w:t>tiene una definición uniforme. Se expone a continuación el concepto de Quiroga A,</w:t>
-          </w:r>
-          <w:r>
-            <w:br/>
-          </w:r>
-          <w:r>
-            <w:rPr>
-              <w:rFonts w:ascii="Arial" w:hAnsi="Arial" w:cs="Arial"/>
-            </w:rPr>
             <w:t>que la define como: "Un enfoque pedagógico en el que la instrucción directa mueve</w:t>
           </w:r>
           <w:r>
@@ -2747,6 +2753,7 @@
           <w:szCs w:val="24"/>
           <w:lang w:val="es-ES_tradnl"/>
         </w:rPr>
+        <w:lastRenderedPageBreak/>
         <w:t>PROCESO DE IMPLEMENTACIÓN</w:t>
       </w:r>
     </w:p>
@@ -2947,6 +2954,7 @@
             <w:docPart w:val="6839B41A5566456687C97690AF7834A0"/>
           </w:placeholder>
         </w:sdtPr>
+        <w:sdtEndPr/>
         <w:sdtContent>
           <w:r>
             <w:rPr>
@@ -3601,60 +3609,6 @@
       <w:pStyle w:val="Footer"/>
       <w:jc w:val="right"/>
     </w:pPr>
-    <w:r>
-      <w:rPr>
-        <w:noProof/>
-        <w:lang w:eastAsia="es-CO"/>
-      </w:rPr>
-      <w:drawing>
-        <wp:inline distT="0" distB="0" distL="0" distR="0" wp14:anchorId="031AD51A" wp14:editId="6E4DCE93">
-          <wp:extent cx="5612130" cy="548005"/>
-          <wp:effectExtent l="0" t="0" r="0" b="4445"/>
-          <wp:docPr id="31" name="Imagen 31" descr="C:\Users\desarrolloprofesoral\AppData\Local\Microsoft\Windows\INetCache\Content.Word\Logos-proyecto-SanGo.png"/>
-          <wp:cNvGraphicFramePr>
-            <a:graphicFrameLocks xmlns:a="http://schemas.openxmlformats.org/drawingml/2006/main" noChangeAspect="1"/>
-          </wp:cNvGraphicFramePr>
-          <a:graphic xmlns:a="http://schemas.openxmlformats.org/drawingml/2006/main">
-            <a:graphicData uri="http://schemas.openxmlformats.org/drawingml/2006/picture">
-              <pic:pic xmlns:pic="http://schemas.openxmlformats.org/drawingml/2006/picture">
-                <pic:nvPicPr>
-                  <pic:cNvPr id="0" name="Picture 12" descr="C:\Users\desarrolloprofesoral\AppData\Local\Microsoft\Windows\INetCache\Content.Word\Logos-proyecto-SanGo.png"/>
-                  <pic:cNvPicPr>
-                    <a:picLocks noChangeAspect="1" noChangeArrowheads="1"/>
-                  </pic:cNvPicPr>
-                </pic:nvPicPr>
-                <pic:blipFill>
-                  <a:blip r:embed="rId1">
-                    <a:extLst>
-                      <a:ext uri="{28A0092B-C50C-407E-A947-70E740481C1C}">
-                        <a14:useLocalDpi xmlns:a14="http://schemas.microsoft.com/office/drawing/2010/main" val="0"/>
-                      </a:ext>
-                    </a:extLst>
-                  </a:blip>
-                  <a:srcRect/>
-                  <a:stretch>
-                    <a:fillRect/>
-                  </a:stretch>
-                </pic:blipFill>
-                <pic:spPr bwMode="auto">
-                  <a:xfrm>
-                    <a:off x="0" y="0"/>
-                    <a:ext cx="5612130" cy="548005"/>
-                  </a:xfrm>
-                  <a:prstGeom prst="rect">
-                    <a:avLst/>
-                  </a:prstGeom>
-                  <a:noFill/>
-                  <a:ln>
-                    <a:noFill/>
-                  </a:ln>
-                </pic:spPr>
-              </pic:pic>
-            </a:graphicData>
-          </a:graphic>
-        </wp:inline>
-      </w:drawing>
-    </w:r>
     <w:r>
       <w:t xml:space="preserve"> </w:t>
     </w:r>
@@ -5404,6 +5358,7 @@
   <w:rsids>
     <w:rsidRoot w:val="00A823CB"/>
     <w:rsid w:val="008C2C14"/>
+    <w:rsid w:val="009476D1"/>
     <w:rsid w:val="00A823CB"/>
     <w:rsid w:val="00C8697D"/>
     <w:rsid w:val="00CA3C7B"/>

</xml_diff>